<commit_message>
Add tested holds desk, green interface, pickup branch links and updated documentation
</commit_message>
<xml_diff>
--- a/docs/HIT339_Group8_Requirements_Draft.docx
+++ b/docs/HIT339_Group8_Requirements_Draft.docx
@@ -7,23 +7,21 @@
         <w:pStyle w:val="Title"/>
       </w:pPr>
       <w:r>
+        <w:rPr>
+          <w:color w:val="000000"/>
+          <w:u w:val="none"/>
+        </w:rPr>
         <w:t>TopEndLibraryHub requirements</w:t>
       </w:r>
     </w:p>
     <w:p>
       <w:r>
-        <w:t>Group 8   |   HIT339 Distributed Development   |   3 October 2026</w:t>
+        <w:t>Group 8   |   HIT339 Distributed Development   |   Updated 14 October 2026</w:t>
       </w:r>
     </w:p>
     <w:p>
       <w:r>
-        <w:rPr>
-          <w:b/>
-        </w:rPr>
-        <w:t>Version 0.1</w:t>
-      </w:r>
-      <w:r>
-        <w:t xml:space="preserve">   Status Draft for group review</w:t>
+        <w:t>Version 0.2   Status Requirements and implementation review</w:t>
       </w:r>
     </w:p>
     <w:p>
@@ -33,7 +31,7 @@
     </w:p>
     <w:p>
       <w:r>
-        <w:t>This document defines the seven required expansions and the checks we will use to decide whether they work. The assignment brief defines the required scope. Routes, branch names, business rules and owners below are proposed choices for the group to review.</w:t>
+        <w:t>This document defines the seven required expansions, our acceptance checks and the implementation decisions recorded to date. The assignment brief sets the required scope. Proposed additions and checks still awaiting evidence remain identified; a planned outcome is not treated as a completed result.</w:t>
       </w:r>
     </w:p>
     <w:p>
@@ -41,6 +39,10 @@
         <w:pStyle w:val="Heading2"/>
       </w:pPr>
       <w:r>
+        <w:rPr>
+          <w:color w:val="000000"/>
+          <w:u w:val="none"/>
+        </w:rPr>
         <w:t>Scope and proposed ownership</w:t>
       </w:r>
     </w:p>
@@ -749,6 +751,10 @@
         <w:pStyle w:val="Heading2"/>
       </w:pPr>
       <w:r>
+        <w:rPr>
+          <w:color w:val="000000"/>
+          <w:u w:val="none"/>
+        </w:rPr>
         <w:t>Baseline and implementation approach</w:t>
       </w:r>
     </w:p>
@@ -759,7 +765,7 @@
     </w:p>
     <w:p>
       <w:r>
-        <w:t>Build, startup and the separate Group 8 database setup have been reported complete by the lead. Functional and integration checks in this document are planned work. The technical installation guide will be verified on a virtual machine.</w:t>
+        <w:t>Kamalpreet reports completing the first staff hold test batch on 14 October and applying the membership validation fix. The generated pickup-branch migration was supplied and reviewed. Three test screenshots remain on the laptop and their detailed outcomes are to be matched to the record. Shared allocation and circulation integration, final acceptance checks and the VM installation test remain outstanding.</w:t>
       </w:r>
     </w:p>
     <w:p>
@@ -791,15 +797,14 @@
       </w:hyperlink>
     </w:p>
     <w:p>
-      <w:r>
-        <w:br w:type="page"/>
-      </w:r>
-    </w:p>
-    <w:p>
       <w:pPr>
         <w:pStyle w:val="Heading1"/>
       </w:pPr>
       <w:r>
+        <w:rPr>
+          <w:color w:val="000000"/>
+          <w:u w:val="none"/>
+        </w:rPr>
         <w:t>Patron access channels</w:t>
       </w:r>
     </w:p>
@@ -808,17 +813,21 @@
         <w:pStyle w:val="Heading2"/>
       </w:pPr>
       <w:r>
+        <w:rPr>
+          <w:color w:val="000000"/>
+          <w:u w:val="none"/>
+        </w:rPr>
         <w:t>R01 Self service kiosk</w:t>
       </w:r>
     </w:p>
     <w:p>
       <w:r>
-        <w:t>Required outcome: Patrons use a dedicated, simplified touch interface to scan a library code, borrow items and view their account summary. Proposed route: /Kiosk. The kiosk is configured for its physical branch.</w:t>
+        <w:t>Required outcome: The brief requires a dedicated, simplified touch interface that scans a library code for checkout or provides an account summary. Our group plan proposes both capabilities through /Kiosk. Checkout must use the configured physical branch and shared lending rules.</w:t>
       </w:r>
     </w:p>
     <w:p>
       <w:r>
-        <w:t>We propose separate inputs for the borrower MembershipNumber and the item LibraryCode, with scanner and keyboard entry. Account access will include a verification step agreed in Q2. The summary will show the patron's active loans, due dates, fines and hold progress.</w:t>
+        <w:t>Patrons sign in through the existing ASP.NET Core Identity service. An optional unique Identity user link identifies the Borrower record, and private account data is resolved from the authenticated user ID. Item LibraryCode supports scanner or keyboard entry. The current member branch contains an account-summary implementation; checkout remains blocked until shared borrowing rules are integrated. Hold progress is a proposed additional account feature.</w:t>
       </w:r>
     </w:p>
     <w:p>
@@ -882,17 +891,21 @@
         <w:pStyle w:val="Heading2"/>
       </w:pPr>
       <w:r>
+        <w:rPr>
+          <w:color w:val="000000"/>
+          <w:u w:val="none"/>
+        </w:rPr>
         <w:t>R02 Secure read only API</w:t>
       </w:r>
     </w:p>
     <w:p>
       <w:r>
-        <w:t>Required outcome: External applications can query available catalogue items, categories and operating status through authenticated REST endpoints. Proposed routes are GET /api/v1/items, /api/v1/categories and /api/v1/status. Authentication details are resolved in Q3.</w:t>
+        <w:t>Required outcome: External applications query available items, categories and operating status through authenticated read-only REST endpoints. Mehakpreet's current routes are GET /api/catalogue/available, /api/catalogue/categories and /api/catalogue/status, with search and item lookup under /api/catalogue. API-key configuration and authentication results remain to be verified after integration.</w:t>
       </w:r>
     </w:p>
     <w:p>
       <w:r>
-        <w:t>Item queries will support branch and category filters. Operating status will identify each demonstration branch and its configured open, closed or maintenance status. A copy allocated for pickup or in transit is excluded from the generally available stock.</w:t>
+        <w:t>The current API status action reports system and database health. Whether branch opening status is also expected remains a clarification in Q3. Branch and category filters are proposed enhancements. General availability must exclude active loans, transit transfers and pickup reservations after shared-rule integration.</w:t>
       </w:r>
     </w:p>
     <w:p>
@@ -942,6 +955,10 @@
         <w:pStyle w:val="Heading2"/>
       </w:pPr>
       <w:r>
+        <w:rPr>
+          <w:color w:val="000000"/>
+          <w:u w:val="none"/>
+        </w:rPr>
         <w:t>Patron search guide</w:t>
       </w:r>
     </w:p>
@@ -951,15 +968,14 @@
       </w:r>
     </w:p>
     <w:p>
-      <w:r>
-        <w:br w:type="page"/>
-      </w:r>
-    </w:p>
-    <w:p>
       <w:pPr>
         <w:pStyle w:val="Heading1"/>
       </w:pPr>
       <w:r>
+        <w:rPr>
+          <w:color w:val="000000"/>
+          <w:u w:val="none"/>
+        </w:rPr>
         <w:t>Branches and fair reservation queues</w:t>
       </w:r>
     </w:p>
@@ -968,12 +984,16 @@
         <w:pStyle w:val="Heading2"/>
       </w:pPr>
       <w:r>
+        <w:rPr>
+          <w:color w:val="000000"/>
+          <w:u w:val="none"/>
+        </w:rPr>
         <w:t>R04 Branch inventory and transfers</w:t>
       </w:r>
     </w:p>
     <w:p>
       <w:r>
-        <w:t>Required outcome: Every item and reception desk belongs to a physical branch, and authorised staff can coordinate transfers. Proposed seed data contains the three demonstration branches and one reception desk per branch. A transfer records its source, destination, item, status, staff member and timestamps.</w:t>
+        <w:t>Required outcome: Every physical item and reception desk belongs to a branch, and authorised staff coordinate transfers. Integrated source contains Darwin Hub, Palmerston Hub and Casuarina Hub with reception desks DAR-D01, PAL-D01 and CAS-D01. A transfer records origin, destination, item, dispatch and receipt details. Final runtime and VM checks remain required.</w:t>
       </w:r>
     </w:p>
     <w:p>
@@ -1037,12 +1057,16 @@
         <w:pStyle w:val="Heading2"/>
       </w:pPr>
       <w:r>
+        <w:rPr>
+          <w:color w:val="000000"/>
+          <w:u w:val="none"/>
+        </w:rPr>
         <w:t>R05 Holds and waitlists</w:t>
       </w:r>
     </w:p>
     <w:p>
       <w:r>
-        <w:t>Required outcome: Patrons place holds on borrowed or damaged items, and the next person is notified when an item becomes available. Proposed queues apply to individual physical copies identified by LibraryCode. Patrons choose a pickup branch and can view or cancel their own hold.</w:t>
+        <w:t>Required outcome: Holds can be requested for borrowed or damaged items, and the next eligible person is notified when a usable copy becomes available. Queues apply to individual physical copies identified by LibraryCode. The first implemented desk supports staff-assisted requests by Admin or Reception with a selected active pickup branch. Patron self-service access is a subsequent integration target.</w:t>
       </w:r>
     </w:p>
     <w:p>
@@ -1050,13 +1074,7 @@
         <w:spacing w:after="100"/>
       </w:pPr>
       <w:r>
-        <w:rPr>
-          <w:b/>
-        </w:rPr>
-        <w:t>H01</w:t>
-      </w:r>
-      <w:r>
-        <w:t xml:space="preserve">  Two active patrons request the same borrowed or damaged copy. Both holds are saved in order of creation, with the hold ID breaking timestamp ties. Duplicate active holds by the same patron are rejected.</w:t>
+        <w:t>H01  Two active members request the same borrowed or damaged copy at an active pickup branch. Requests are ordered by creation time, with hold ID breaking timestamp ties. Duplicate active requests by the same member are rejected. Inactive memberships or pickup branches pause eligibility without rewriting the original request timestamp.</w:t>
       </w:r>
     </w:p>
     <w:p>
@@ -1064,13 +1082,7 @@
         <w:spacing w:after="100"/>
       </w:pPr>
       <w:r>
-        <w:rPr>
-          <w:b/>
-        </w:rPr>
-        <w:t>H02</w:t>
-      </w:r>
-      <w:r>
-        <w:t xml:space="preserve">  Return or repair allocates the eligible copy to the first active person in the queue and logs a notification. A patron later in the queue and an unrelated visitor cannot borrow that allocation.</w:t>
+        <w:t>H02  A return or completed repair allocates the usable copy to the next eligible waiting member. If it is physically at the selected pickup branch, it becomes ready for collection and a simulated pickup notification is logged. A later queued member or unrelated borrower cannot take the allocation.</w:t>
       </w:r>
     </w:p>
     <w:p>
@@ -1078,13 +1090,7 @@
         <w:spacing w:after="100"/>
       </w:pPr>
       <w:r>
-        <w:rPr>
-          <w:b/>
-        </w:rPr>
-        <w:t>H03</w:t>
-      </w:r>
-      <w:r>
-        <w:t xml:space="preserve">  If the pickup branch differs, staff coordinate a transfer. The patron receives an allocation message first and a ready for pickup message after receipt. The second patron remains waiting until the first hold is fulfilled or cancelled.</w:t>
+        <w:t>H03  If pickup is at another branch, the request displays its allocation while staff coordinate a protected transfer. A ready-for-pickup notification is logged only after destination receipt. The next member remains waiting until the current allocation is fulfilled or cancelled; the transferred copy is never advertised for general checkout during the handover.</w:t>
       </w:r>
     </w:p>
     <w:p>
@@ -1106,6 +1112,10 @@
         <w:pStyle w:val="Heading2"/>
       </w:pPr>
       <w:r>
+        <w:rPr>
+          <w:color w:val="000000"/>
+          <w:u w:val="none"/>
+        </w:rPr>
         <w:t>One availability rule across modules</w:t>
       </w:r>
     </w:p>
@@ -1120,15 +1130,14 @@
       </w:r>
     </w:p>
     <w:p>
-      <w:r>
-        <w:br w:type="page"/>
-      </w:r>
-    </w:p>
-    <w:p>
       <w:pPr>
         <w:pStyle w:val="Heading1"/>
       </w:pPr>
       <w:r>
+        <w:rPr>
+          <w:color w:val="000000"/>
+          <w:u w:val="none"/>
+        </w:rPr>
         <w:t>Notifications importing and reporting</w:t>
       </w:r>
     </w:p>
@@ -1137,6 +1146,10 @@
         <w:pStyle w:val="Heading2"/>
       </w:pPr>
       <w:r>
+        <w:rPr>
+          <w:color w:val="000000"/>
+          <w:u w:val="none"/>
+        </w:rPr>
         <w:t>R03 Simulated email and SMS notifications</w:t>
       </w:r>
     </w:p>
@@ -1192,6 +1205,10 @@
         <w:pStyle w:val="Heading2"/>
       </w:pPr>
       <w:r>
+        <w:rPr>
+          <w:color w:val="000000"/>
+          <w:u w:val="none"/>
+        </w:rPr>
         <w:t>R06 Administrative CSV importer</w:t>
       </w:r>
     </w:p>
@@ -1247,6 +1264,10 @@
         <w:pStyle w:val="Heading2"/>
       </w:pPr>
       <w:r>
+        <w:rPr>
+          <w:color w:val="000000"/>
+          <w:u w:val="none"/>
+        </w:rPr>
         <w:t>R07 Manager analytics and exports</w:t>
       </w:r>
     </w:p>
@@ -1298,15 +1319,14 @@
       </w:r>
     </w:p>
     <w:p>
-      <w:r>
-        <w:br w:type="page"/>
-      </w:r>
-    </w:p>
-    <w:p>
       <w:pPr>
         <w:pStyle w:val="Heading1"/>
       </w:pPr>
       <w:r>
+        <w:rPr>
+          <w:color w:val="000000"/>
+          <w:u w:val="none"/>
+        </w:rPr>
         <w:t>Shared rules and integration checks</w:t>
       </w:r>
     </w:p>
@@ -1315,6 +1335,10 @@
         <w:pStyle w:val="Heading2"/>
       </w:pPr>
       <w:r>
+        <w:rPr>
+          <w:color w:val="000000"/>
+          <w:u w:val="none"/>
+        </w:rPr>
         <w:t>Proposed rules for the first implementation</w:t>
       </w:r>
     </w:p>
@@ -1338,12 +1362,16 @@
         <w:pStyle w:val="Heading2"/>
       </w:pPr>
       <w:r>
+        <w:rPr>
+          <w:color w:val="000000"/>
+          <w:u w:val="none"/>
+        </w:rPr>
         <w:t>Demonstration journey for a repaired toy</w:t>
       </w:r>
     </w:p>
     <w:p>
       <w:r>
-        <w:t>Use fictional patrons P001 and P002 and toy TY-0001. Both patrons choose Palmerston Hub for pickup. This journey will supply the later user journey map and integration diagram.</w:t>
+        <w:t>Use a separate fictional demonstration copy TY-9001 and active members MBR-9001 and MBR-9002. Create fresh requests for this planned integration journey so earlier cancellation tests do not determine its queue order. Both members select Palmerston Hub for pickup. The journey remains planned until automatic allocation and handover are integrated.</w:t>
       </w:r>
     </w:p>
     <w:tbl>
@@ -1473,11 +1501,6 @@
               <w:jc w:val="center"/>
             </w:pPr>
             <w:r>
-              <w:rPr>
-                <w:b w:val="0"/>
-                <w:color w:val="000000"/>
-                <w:sz w:val="20"/>
-              </w:rPr>
               <w:t>1</w:t>
             </w:r>
           </w:p>
@@ -1499,12 +1522,7 @@
               <w:spacing w:before="0" w:after="40" w:line="240" w:lineRule="auto"/>
             </w:pPr>
             <w:r>
-              <w:rPr>
-                <w:b w:val="0"/>
-                <w:color w:val="000000"/>
-                <w:sz w:val="20"/>
-              </w:rPr>
-              <w:t>TY-0001 is damaged at Darwin Hub. P001 then P002 request holds.</w:t>
+              <w:t>TY-9001 is damaged at Darwin Hub. MBR-9001 then MBR-9002 request holds.</w:t>
             </w:r>
           </w:p>
         </w:tc>
@@ -1525,12 +1543,7 @@
               <w:spacing w:before="0" w:after="40" w:line="240" w:lineRule="auto"/>
             </w:pPr>
             <w:r>
-              <w:rPr>
-                <w:b w:val="0"/>
-                <w:color w:val="000000"/>
-                <w:sz w:val="20"/>
-              </w:rPr>
-              <w:t>Both requests are accepted; P001 is first.</w:t>
+              <w:t>Both requests are accepted; MBR-9001 is first.</w:t>
             </w:r>
           </w:p>
         </w:tc>
@@ -1557,11 +1570,6 @@
               <w:jc w:val="center"/>
             </w:pPr>
             <w:r>
-              <w:rPr>
-                <w:b w:val="0"/>
-                <w:color w:val="000000"/>
-                <w:sz w:val="20"/>
-              </w:rPr>
               <w:t>2</w:t>
             </w:r>
           </w:p>
@@ -1583,11 +1591,6 @@
               <w:spacing w:before="0" w:after="40" w:line="240" w:lineRule="auto"/>
             </w:pPr>
             <w:r>
-              <w:rPr>
-                <w:b w:val="0"/>
-                <w:color w:val="000000"/>
-                <w:sz w:val="20"/>
-              </w:rPr>
               <w:t>Admin records the completed repair.</w:t>
             </w:r>
           </w:p>
@@ -1605,16 +1608,8 @@
             <w:shd w:fill="F1F4F6"/>
           </w:tcPr>
           <w:p>
-            <w:pPr>
-              <w:spacing w:before="0" w:after="40" w:line="240" w:lineRule="auto"/>
-            </w:pPr>
             <w:r>
-              <w:rPr>
-                <w:b w:val="0"/>
-                <w:color w:val="000000"/>
-                <w:sz w:val="20"/>
-              </w:rPr>
-              <w:t>P001 receives the allocation message. The copy is reserved for P001.</w:t>
+              <w:t>MBR-9001 is allocated the repaired copy. Its request shows that a transfer to the pickup branch is needed.</w:t>
             </w:r>
           </w:p>
         </w:tc>
@@ -1641,11 +1636,6 @@
               <w:jc w:val="center"/>
             </w:pPr>
             <w:r>
-              <w:rPr>
-                <w:b w:val="0"/>
-                <w:color w:val="000000"/>
-                <w:sz w:val="20"/>
-              </w:rPr>
               <w:t>3</w:t>
             </w:r>
           </w:p>
@@ -1667,11 +1657,6 @@
               <w:spacing w:before="0" w:after="40" w:line="240" w:lineRule="auto"/>
             </w:pPr>
             <w:r>
-              <w:rPr>
-                <w:b w:val="0"/>
-                <w:color w:val="000000"/>
-                <w:sz w:val="20"/>
-              </w:rPr>
               <w:t>Reception dispatches the toy to Palmerston Hub.</w:t>
             </w:r>
           </w:p>
@@ -1693,11 +1678,6 @@
               <w:spacing w:before="0" w:after="40" w:line="240" w:lineRule="auto"/>
             </w:pPr>
             <w:r>
-              <w:rPr>
-                <w:b w:val="0"/>
-                <w:color w:val="000000"/>
-                <w:sz w:val="20"/>
-              </w:rPr>
               <w:t>The transfer is in transit; checkout is blocked.</w:t>
             </w:r>
           </w:p>
@@ -1725,11 +1705,6 @@
               <w:jc w:val="center"/>
             </w:pPr>
             <w:r>
-              <w:rPr>
-                <w:b w:val="0"/>
-                <w:color w:val="000000"/>
-                <w:sz w:val="20"/>
-              </w:rPr>
               <w:t>4</w:t>
             </w:r>
           </w:p>
@@ -1751,11 +1726,6 @@
               <w:spacing w:before="0" w:after="40" w:line="240" w:lineRule="auto"/>
             </w:pPr>
             <w:r>
-              <w:rPr>
-                <w:b w:val="0"/>
-                <w:color w:val="000000"/>
-                <w:sz w:val="20"/>
-              </w:rPr>
               <w:t>Palmerston Reception confirms arrival.</w:t>
             </w:r>
           </w:p>
@@ -1777,12 +1747,7 @@
               <w:spacing w:before="0" w:after="40" w:line="240" w:lineRule="auto"/>
             </w:pPr>
             <w:r>
-              <w:rPr>
-                <w:b w:val="0"/>
-                <w:color w:val="000000"/>
-                <w:sz w:val="20"/>
-              </w:rPr>
-              <w:t>The item's physical branch changes; P001 receives the pickup message.</w:t>
+              <w:t>The item's physical branch changes; MBR-9001 receives the pickup message.</w:t>
             </w:r>
           </w:p>
         </w:tc>
@@ -1809,11 +1774,6 @@
               <w:jc w:val="center"/>
             </w:pPr>
             <w:r>
-              <w:rPr>
-                <w:b w:val="0"/>
-                <w:color w:val="000000"/>
-                <w:sz w:val="20"/>
-              </w:rPr>
               <w:t>5</w:t>
             </w:r>
           </w:p>
@@ -1835,12 +1795,7 @@
               <w:spacing w:before="0" w:after="40" w:line="240" w:lineRule="auto"/>
             </w:pPr>
             <w:r>
-              <w:rPr>
-                <w:b w:val="0"/>
-                <w:color w:val="000000"/>
-                <w:sz w:val="20"/>
-              </w:rPr>
-              <w:t>P001 checks out the toy through the Palmerston kiosk.</w:t>
+              <w:t>MBR-9001 checks out the toy through the Palmerston kiosk.</w:t>
             </w:r>
           </w:p>
         </w:tc>
@@ -1861,12 +1816,7 @@
               <w:spacing w:before="0" w:after="40" w:line="240" w:lineRule="auto"/>
             </w:pPr>
             <w:r>
-              <w:rPr>
-                <w:b w:val="0"/>
-                <w:color w:val="000000"/>
-                <w:sz w:val="20"/>
-              </w:rPr>
-              <w:t>One loan is created; P001's hold is fulfilled; P002 keeps waiting.</w:t>
+              <w:t>One loan is created; MBR-9001's hold is fulfilled; MBR-9002 keeps waiting.</w:t>
             </w:r>
           </w:p>
         </w:tc>
@@ -1893,11 +1843,6 @@
               <w:jc w:val="center"/>
             </w:pPr>
             <w:r>
-              <w:rPr>
-                <w:b w:val="0"/>
-                <w:color w:val="000000"/>
-                <w:sz w:val="20"/>
-              </w:rPr>
               <w:t>6</w:t>
             </w:r>
           </w:p>
@@ -1919,12 +1864,7 @@
               <w:spacing w:before="0" w:after="40" w:line="240" w:lineRule="auto"/>
             </w:pPr>
             <w:r>
-              <w:rPr>
-                <w:b w:val="0"/>
-                <w:color w:val="000000"/>
-                <w:sz w:val="20"/>
-              </w:rPr>
-              <w:t>P001 returns the toy in usable condition.</w:t>
+              <w:t>MBR-9001 returns the toy in usable condition.</w:t>
             </w:r>
           </w:p>
         </w:tc>
@@ -1941,16 +1881,8 @@
             <w:shd w:fill="F1F4F6"/>
           </w:tcPr>
           <w:p>
-            <w:pPr>
-              <w:spacing w:before="0" w:after="40" w:line="240" w:lineRule="auto"/>
-            </w:pPr>
             <w:r>
-              <w:rPr>
-                <w:b w:val="0"/>
-                <w:color w:val="000000"/>
-                <w:sz w:val="20"/>
-              </w:rPr>
-              <w:t>P002 becomes the allocated patron and is notified.</w:t>
+              <w:t>MBR-9002 becomes the next allocated member. A pickup notification is logged when the copy is ready at the selected branch.</w:t>
             </w:r>
           </w:p>
         </w:tc>
@@ -1967,6 +1899,10 @@
         <w:pStyle w:val="Heading2"/>
       </w:pPr>
       <w:r>
+        <w:rPr>
+          <w:color w:val="000000"/>
+          <w:u w:val="none"/>
+        </w:rPr>
         <w:t>Integration checks to record</w:t>
       </w:r>
     </w:p>
@@ -1975,13 +1911,7 @@
         <w:spacing w:after="100"/>
       </w:pPr>
       <w:r>
-        <w:rPr>
-          <w:b/>
-        </w:rPr>
-        <w:t>T01</w:t>
-      </w:r>
-      <w:r>
-        <w:t xml:space="preserve">  Send two checkout attempts for one copy through kiosk and Reception together. Exactly one succeeds and one active loan remains in the database.</w:t>
+        <w:t>T01  Attempt kiosk and Reception checkout for the same copy concurrently. Exactly one checkout succeeds and one active loan remains.</w:t>
       </w:r>
     </w:p>
     <w:p>
@@ -1989,13 +1919,7 @@
         <w:spacing w:after="100"/>
       </w:pPr>
       <w:r>
-        <w:rPr>
-          <w:b/>
-        </w:rPr>
-        <w:t>T02</w:t>
-      </w:r>
-      <w:r>
-        <w:t xml:space="preserve">  Run due and fine checks twice on the same business date. Each qualifying event has one notification. Advance the test date and verify the next expected fine update.</w:t>
+        <w:t>T02  Run notification checks twice on one Darwin business date. Each qualifying event/channel occurs once. Repeat on the next date to verify the expected fine update.</w:t>
       </w:r>
     </w:p>
     <w:p>
@@ -2003,23 +1927,12 @@
         <w:spacing w:after="100"/>
       </w:pPr>
       <w:r>
-        <w:rPr>
-          <w:b/>
-        </w:rPr>
-        <w:t>T03</w:t>
-      </w:r>
-      <w:r>
-        <w:t xml:space="preserve">  Use a known $4.50 fine. Before payment, collected revenue is $0 for that fine. After payment, collected revenue is $4.50 and a second payment attempt leaves that total unchanged.</w:t>
+        <w:t>T03  For a $4.50 fine, collected revenue is $0 before payment and $4.50 afterwards. A repeated payment action leaves the collected total unchanged.</w:t>
       </w:r>
     </w:p>
     <w:p>
       <w:r>
-        <w:t>For every check record the requirement ID, test date, branch, inputs, expected result, actual result, tester and commit. Keep screenshots or response captures and link any failure to its fix and retest. These checks are planned; record results after execution.</w:t>
-      </w:r>
-    </w:p>
-    <w:p>
-      <w:r>
-        <w:br w:type="page"/>
+        <w:t>Record requirement, date, branch, input, expected and actual result, tester, revision and evidence. Link failures to their fix and retest. These integration checks remain planned.</w:t>
       </w:r>
     </w:p>
     <w:p>
@@ -2027,6 +1940,10 @@
         <w:pStyle w:val="Heading1"/>
       </w:pPr>
       <w:r>
+        <w:rPr>
+          <w:color w:val="000000"/>
+          <w:u w:val="none"/>
+        </w:rPr>
         <w:t>Questions and requirement review</w:t>
       </w:r>
     </w:p>
@@ -2054,13 +1971,7 @@
         <w:spacing w:after="100"/>
       </w:pPr>
       <w:r>
-        <w:rPr>
-          <w:b/>
-        </w:rPr>
-        <w:t>Q2</w:t>
-      </w:r>
-      <w:r>
-        <w:t xml:space="preserve">  What verifies the patron at the kiosk and hold page? Proposed default is membership number plus a library PIN. Confirm whether physical scanner hardware is required or keyboard entry simulating a scanner is acceptable.</w:t>
+        <w:t>Q2  Identity login and a unique optional Borrower link are the selected implementation approach; membership-number input alone does not grant private account access. Confirm the ownership-verification process used when staff link an account, the kiosk timeout/reset behaviour, and whether keyboard entry simulating a scanner is sufficient.</w:t>
       </w:r>
     </w:p>
     <w:p>
@@ -2124,17 +2035,21 @@
         <w:pStyle w:val="Heading2"/>
       </w:pPr>
       <w:r>
+        <w:rPr>
+          <w:color w:val="000000"/>
+          <w:u w:val="none"/>
+        </w:rPr>
         <w:t>Review and change record</w:t>
       </w:r>
     </w:p>
     <w:p>
       <w:r>
-        <w:t>Kamalpreet will maintain this draft. Each module lead will review its checks and dependencies. Group acceptance will record the date and the members who agreed. Changes after acceptance will identify the reason, affected requirement IDs, task estimate and any test that needs updating.</w:t>
+        <w:t>Kamalpreet coordinates requirement decisions and reports observed behaviour. Written updates are compiled from those reports and inspected source with AI assistance. Each module lead reviews the checks and dependencies for their own contribution. Group acceptance still requires the actual date and members who agreed; each material change identifies its reason, affected requirements and tests.</w:t>
       </w:r>
     </w:p>
     <w:p>
       <w:r>
-        <w:t>Move the requirements task to In Progress while drafting and reviewing it. Completion evidence is the reviewed document plus the recorded answers and decisions. Actual hours are entered from each member's work log.</w:t>
+        <w:t>The current review records the staff hold desk, branch schema integration and the capitalisation improvement. Remaining requirement answers, real person-hours and module acceptance outcomes are collected from the members rather than inferred from source presence or elapsed calendar time.</w:t>
       </w:r>
     </w:p>
     <w:p>
@@ -2142,6 +2057,10 @@
         <w:pStyle w:val="Heading2"/>
       </w:pPr>
       <w:r>
+        <w:rPr>
+          <w:color w:val="000000"/>
+          <w:u w:val="none"/>
+        </w:rPr>
         <w:t>Required portfolio evidence</w:t>
       </w:r>
     </w:p>
@@ -2160,12 +2079,96 @@
         <w:pStyle w:val="Heading2"/>
       </w:pPr>
       <w:r>
+        <w:rPr>
+          <w:color w:val="000000"/>
+          <w:u w:val="none"/>
+        </w:rPr>
         <w:t>Source references</w:t>
       </w:r>
     </w:p>
     <w:p>
       <w:r>
         <w:t>CDU HIT339 Group Project Management and Horizontal Feature Expansion brief, pages 1 and 2. Selected Assignment 2 source: Kamalpreet S389008 TopEndLibraryHub, including the models, LoansController and startup database initializer. Lecturer announcement supplied in the project discussion: requirements questions, product presentation, acted on UX feedback, breadth and depth.</w:t>
+      </w:r>
+    </w:p>
+    <w:p>
+      <w:pPr>
+        <w:pStyle w:val="Heading1"/>
+      </w:pPr>
+      <w:r>
+        <w:rPr>
+          <w:color w:val="000000"/>
+        </w:rPr>
+        <w:t>Implementation decisions recorded on 14 October</w:t>
+      </w:r>
+    </w:p>
+    <w:p>
+      <w:r>
+        <w:t>The verified source merge is 74668e1. The subsequent staff hold desk and green interface are a local batch awaiting a verified pushed revision. Source observations and user-reported tests are distinguished below so the review remains traceable.</w:t>
+      </w:r>
+    </w:p>
+    <w:p>
+      <w:pPr>
+        <w:pStyle w:val="Heading2"/>
+      </w:pPr>
+      <w:r>
+        <w:rPr>
+          <w:color w:val="000000"/>
+        </w:rPr>
+        <w:t>Pickup branch relationship</w:t>
+      </w:r>
+    </w:p>
+    <w:p>
+      <w:r>
+        <w:t>Kamalpreet supplied LinkHoldsToPickupBranches. The reviewed migration creates an index on Holds.PickupBranchId and a restricted foreign key to Branches.Id, preserving the shared branch identifiers. The resulting relationship supports real pickup-branch selection. Transfer receipt and pickup notifications still require workflow integration.</w:t>
+      </w:r>
+    </w:p>
+    <w:p>
+      <w:pPr>
+        <w:pStyle w:val="Heading2"/>
+      </w:pPr>
+      <w:r>
+        <w:rPr>
+          <w:color w:val="000000"/>
+        </w:rPr>
+        <w:t>Reported hold test completion</w:t>
+      </w:r>
+    </w:p>
+    <w:p>
+      <w:r>
+        <w:t>Kamalpreet reported completing duplicate-request rejection, two-member waiting order and waiting cancellation on 14 October. Three screenshots are saved on the laptop using the tester's own names or captions. Individual observed outcomes and image references have not yet been matched to the written test record. The expected outcomes remain in docs/HOLD_WORKFLOW_TEST_RECORD.md.</w:t>
+      </w:r>
+    </w:p>
+    <w:p>
+      <w:pPr>
+        <w:pStyle w:val="Heading2"/>
+      </w:pPr>
+      <w:r>
+        <w:rPr>
+          <w:color w:val="000000"/>
+        </w:rPr>
+        <w:t>Membership validation improvement</w:t>
+      </w:r>
+    </w:p>
+    <w:p>
+      <w:r>
+        <w:t>The registration form visually displayed uppercase letters while its original model pattern accepted only uppercase input. The tester confirmed that lowercase typing caused a format error and uppercase re-entry succeeded. Kamalpreet then confirmed changing the pattern to ^[Mm][Bb][Rr]-[0-9]{4}$. This accepts natural letter case while preserving the membership format and existing uppercase storage. The particular lowercase registration retest is still to be confirmed.</w:t>
+      </w:r>
+    </w:p>
+    <w:p>
+      <w:pPr>
+        <w:pStyle w:val="Heading2"/>
+      </w:pPr>
+      <w:r>
+        <w:rPr>
+          <w:color w:val="000000"/>
+        </w:rPr>
+        <w:t>Record and evidence maintenance</w:t>
+      </w:r>
+    </w:p>
+    <w:p>
+      <w:r>
+        <w:t>Written requirements and test records are maintained from reported outcomes, source checks and available evidence. Current screenshots can be copied into docs/screenshots without renaming. The earlier notification observations remain documented even though their photo files are not retained locally. Final integration evidence will be captured when the corresponding checks are performed. The final portfolio also requires genuine member inputs for hours, contracts, meetings and individual reflections.</w:t>
       </w:r>
     </w:p>
     <w:sectPr>
@@ -2191,7 +2194,7 @@
       <w:rPr>
         <w:sz w:val="18"/>
       </w:rPr>
-      <w:t xml:space="preserve">Requirements version 0.1   |   Page </w:t>
+      <w:t xml:space="preserve">Requirements version 0.2   |   Page </w:t>
     </w:r>
     <w:fldSimple w:instr="PAGE"/>
   </w:p>
@@ -2654,6 +2657,7 @@
       <w:color w:val="000000"/>
       <w:sz w:val="32"/>
       <w:szCs w:val="28"/>
+      <w:u w:val="none"/>
     </w:rPr>
   </w:style>
   <w:style w:type="paragraph" w:styleId="Heading2">
@@ -2679,6 +2683,7 @@
       <w:color w:val="000000"/>
       <w:sz w:val="25"/>
       <w:szCs w:val="26"/>
+      <w:u w:val="none"/>
     </w:rPr>
   </w:style>
   <w:style w:type="paragraph" w:styleId="Heading3">
@@ -2703,6 +2708,7 @@
       <w:bCs/>
       <w:color w:val="000000"/>
       <w:sz w:val="23"/>
+      <w:u w:val="none"/>
     </w:rPr>
   </w:style>
   <w:style w:type="paragraph" w:styleId="Heading4">
@@ -2944,6 +2950,7 @@
       <w:kern w:val="28"/>
       <w:sz w:val="44"/>
       <w:szCs w:val="52"/>
+      <w:u w:val="none"/>
     </w:rPr>
   </w:style>
   <w:style w:type="character" w:customStyle="1" w:styleId="TitleChar">
@@ -2983,6 +2990,7 @@
       <w:spacing w:val="15"/>
       <w:sz w:val="24"/>
       <w:szCs w:val="24"/>
+      <w:u w:val="none"/>
     </w:rPr>
   </w:style>
   <w:style w:type="character" w:customStyle="1" w:styleId="SubtitleChar">

</xml_diff>

<commit_message>
Integrate circulation and kiosk/API source; document tested hold and repair workflows
</commit_message>
<xml_diff>
--- a/docs/HIT339_Group8_Requirements_Draft.docx
+++ b/docs/HIT339_Group8_Requirements_Draft.docx
@@ -21,7 +21,7 @@
     </w:p>
     <w:p>
       <w:r>
-        <w:t>Version 0.2   Status Requirements and implementation review</w:t>
+        <w:t>Version 0.4   Status Windows circulation results and remaining acceptance work</w:t>
       </w:r>
     </w:p>
     <w:p>
@@ -37,6 +37,7 @@
     <w:p>
       <w:pPr>
         <w:pStyle w:val="Heading2"/>
+        <w:keepNext/>
       </w:pPr>
       <w:r>
         <w:rPr>
@@ -749,6 +750,7 @@
     <w:p>
       <w:pPr>
         <w:pStyle w:val="Heading2"/>
+        <w:keepNext/>
       </w:pPr>
       <w:r>
         <w:rPr>
@@ -764,8 +766,11 @@
       </w:r>
     </w:p>
     <w:p>
+      <w:pPr>
+        <w:spacing w:after="120"/>
+      </w:pPr>
       <w:r>
-        <w:t>Kamalpreet reports completing the first staff hold test batch on 14 October and applying the membership validation fix. The generated pickup-branch migration was supplied and reviewed. Three test screenshots remain on the laptop and their detailed outcomes are to be matched to the record. Shared allocation and circulation integration, final acceptance checks and the VM installation test remain outstanding.</w:t>
+        <w:t>The circulation integration combines baseline dbbc540 and Mehakpreet's 3b925ee source. Windows build succeeded and all seven migrations show Applied=True. Initial hold screenshots and later reported return, repair, protected transfer and next-family collection outcomes are recorded. Pickup history stayed six after restart. Kiosk/API, simultaneous checkout, import/reports, final member records and VM verification remain outstanding.</w:t>
       </w:r>
     </w:p>
     <w:p>
@@ -799,6 +804,7 @@
     <w:p>
       <w:pPr>
         <w:pStyle w:val="Heading1"/>
+        <w:keepNext/>
       </w:pPr>
       <w:r>
         <w:rPr>
@@ -811,6 +817,7 @@
     <w:p>
       <w:pPr>
         <w:pStyle w:val="Heading2"/>
+        <w:keepNext/>
       </w:pPr>
       <w:r>
         <w:rPr>
@@ -821,13 +828,16 @@
       </w:r>
     </w:p>
     <w:p>
+      <w:pPr>
+        <w:keepLines/>
+      </w:pPr>
       <w:r>
         <w:t>Required outcome: The brief requires a dedicated, simplified touch interface that scans a library code for checkout or provides an account summary. Our group plan proposes both capabilities through /Kiosk. Checkout must use the configured physical branch and shared lending rules.</w:t>
       </w:r>
     </w:p>
     <w:p>
       <w:r>
-        <w:t>Patrons sign in through the existing ASP.NET Core Identity service. An optional unique Identity user link identifies the Borrower record, and private account data is resolved from the authenticated user ID. Item LibraryCode supports scanner or keyboard entry. The current member branch contains an account-summary implementation; checkout remains blocked until shared borrowing rules are integrated. Hold progress is a proposed additional account feature.</w:t>
+        <w:t>Patrons sign in through ASP.NET Core Identity. A unique optional Identity link identifies the Borrower, and private account data is resolved from the authenticated user ID. Scanner or keyboard input uses LibraryCode. The applied source includes private account, hold progress and shared checkout; two-minute privacy and runtime ownership/checkout checks remain pending.</w:t>
       </w:r>
     </w:p>
     <w:p>
@@ -889,6 +899,7 @@
     <w:p>
       <w:pPr>
         <w:pStyle w:val="Heading2"/>
+        <w:keepNext/>
       </w:pPr>
       <w:r>
         <w:rPr>
@@ -899,13 +910,16 @@
       </w:r>
     </w:p>
     <w:p>
+      <w:pPr>
+        <w:keepLines/>
+      </w:pPr>
       <w:r>
         <w:t>Required outcome: External applications query available items, categories and operating status through authenticated read-only REST endpoints. Mehakpreet's current routes are GET /api/catalogue/available, /api/catalogue/categories and /api/catalogue/status, with search and item lookup under /api/catalogue. API-key configuration and authentication results remain to be verified after integration.</w:t>
       </w:r>
     </w:p>
     <w:p>
       <w:r>
-        <w:t>The current API status action reports system and database health. Whether branch opening status is also expected remains a clarification in Q3. Branch and category filters are proposed enhancements. General availability must exclude active loans, transit transfers and pickup reservations after shared-rule integration.</w:t>
+        <w:t>The current API reports system and database health. Whether branch opening status is also expected remains Q3. Shared availability excludes active loans, transit and reservations in source; final API authentication and availability responses remain to be demonstrated.</w:t>
       </w:r>
     </w:p>
     <w:p>
@@ -953,6 +967,7 @@
     <w:p>
       <w:pPr>
         <w:pStyle w:val="Heading2"/>
+        <w:keepNext/>
       </w:pPr>
       <w:r>
         <w:rPr>
@@ -970,6 +985,8 @@
     <w:p>
       <w:pPr>
         <w:pStyle w:val="Heading1"/>
+        <w:keepNext/>
+        <w:pageBreakBefore/>
       </w:pPr>
       <w:r>
         <w:rPr>
@@ -982,6 +999,7 @@
     <w:p>
       <w:pPr>
         <w:pStyle w:val="Heading2"/>
+        <w:keepNext/>
       </w:pPr>
       <w:r>
         <w:rPr>
@@ -992,8 +1010,11 @@
       </w:r>
     </w:p>
     <w:p>
+      <w:pPr>
+        <w:keepLines/>
+      </w:pPr>
       <w:r>
-        <w:t>Required outcome: Every physical item and reception desk belongs to a branch, and authorised staff coordinate transfers. Integrated source contains Darwin Hub, Palmerston Hub and Casuarina Hub with reception desks DAR-D01, PAL-D01 and CAS-D01. A transfer records origin, destination, item, dispatch and receipt details. Final runtime and VM checks remain required.</w:t>
+        <w:t>Required outcome: Items and reception desks belong to branches and authorised staff coordinate transfers. Source includes Darwin, Palmerston and Casuarina with DAR-D01, PAL-D01 and CAS-D01. Correct dispatch, invalid destination/transit/origin-receipt guards and first destination handover are reported tested. Repeat receipt and final VM checks remain required.</w:t>
       </w:r>
     </w:p>
     <w:p>
@@ -1055,6 +1076,7 @@
     <w:p>
       <w:pPr>
         <w:pStyle w:val="Heading2"/>
+        <w:keepNext/>
       </w:pPr>
       <w:r>
         <w:rPr>
@@ -1065,8 +1087,11 @@
       </w:r>
     </w:p>
     <w:p>
+      <w:pPr>
+        <w:keepLines/>
+      </w:pPr>
       <w:r>
-        <w:t>Required outcome: Holds can be requested for borrowed or damaged items, and the next eligible person is notified when a usable copy becomes available. Queues apply to individual physical copies identified by LibraryCode. The first implemented desk supports staff-assisted requests by Admin or Reception with a selected active pickup branch. Patron self-service access is a subsequent integration target.</w:t>
+        <w:t>Required outcome: Holds on borrowed or damaged copies notify the next eligible person when a usable copy is ready. Staff placement/cancellation and shared return, repair, transfer and checkout hooks are implemented. The kiosk displays only the linked patron's hold progress; private runtime checks remain pending. Patron self-service placement and pickup expiry remain later targets.</w:t>
       </w:r>
     </w:p>
     <w:p>
@@ -1110,6 +1135,7 @@
     <w:p>
       <w:pPr>
         <w:pStyle w:val="Heading2"/>
+        <w:keepNext/>
       </w:pPr>
       <w:r>
         <w:rPr>
@@ -1132,6 +1158,7 @@
     <w:p>
       <w:pPr>
         <w:pStyle w:val="Heading1"/>
+        <w:keepNext/>
       </w:pPr>
       <w:r>
         <w:rPr>
@@ -1144,6 +1171,7 @@
     <w:p>
       <w:pPr>
         <w:pStyle w:val="Heading2"/>
+        <w:keepNext/>
       </w:pPr>
       <w:r>
         <w:rPr>
@@ -1154,8 +1182,11 @@
       </w:r>
     </w:p>
     <w:p>
+      <w:pPr>
+        <w:keepLines/>
+      </w:pPr>
       <w:r>
-        <w:t>Required outcome: Automated notifications are simulated when an item is borrowed, approaching its due date or accruing fines. We propose a durable staff dashboard showing the recipient, channel, event, item or loan, message and creation time. Messages are marked simulated.</w:t>
+        <w:t>Required outcome: Automated simulations cover borrowing, approaching due dates and accruing fines. The durable staff log records recipient, channel, kind, item/loan, message and time. Initial borrowing/due-soon images and later reported pickup counts exist. Remaining fine/date/contact/access checks are listed in the notification record.</w:t>
       </w:r>
     </w:p>
     <w:p>
@@ -1191,18 +1222,13 @@
         <w:spacing w:after="100"/>
       </w:pPr>
       <w:r>
-        <w:rPr>
-          <w:b/>
-        </w:rPr>
-        <w:t>N03</w:t>
-      </w:r>
-      <w:r>
-        <w:t xml:space="preserve">  Queue allocation and transfer receipt log their corresponding messages. A staff demonstration action may run the same checks immediately; scheduled execution must also be demonstrated.</w:t>
+        <w:t>N03  A usable return, repair or destination receipt makes the eligible pickup request ready only at its selected branch. The corresponding simulated pickup messages are logged after committed state and retried by the worker. Immediate and scheduled rechecks must not duplicate the same ready event/channel.</w:t>
       </w:r>
     </w:p>
     <w:p>
       <w:pPr>
         <w:pStyle w:val="Heading2"/>
+        <w:keepNext/>
       </w:pPr>
       <w:r>
         <w:rPr>
@@ -1262,6 +1288,7 @@
     <w:p>
       <w:pPr>
         <w:pStyle w:val="Heading2"/>
+        <w:keepNext/>
       </w:pPr>
       <w:r>
         <w:rPr>
@@ -1272,6 +1299,9 @@
       </w:r>
     </w:p>
     <w:p>
+      <w:pPr>
+        <w:keepLines/>
+      </w:pPr>
       <w:r>
         <w:t>Required outcome: Managers report borrowing statistics, fine revenue audits and inventory health, with export capability. We propose both CSV and PDF exports, filtered by branch and reporting dates. The dashboard will show each filter and the report generation time.</w:t>
       </w:r>
@@ -1321,6 +1351,7 @@
     <w:p>
       <w:pPr>
         <w:pStyle w:val="Heading1"/>
+        <w:keepNext/>
       </w:pPr>
       <w:r>
         <w:rPr>
@@ -1333,6 +1364,7 @@
     <w:p>
       <w:pPr>
         <w:pStyle w:val="Heading2"/>
+        <w:keepNext/>
       </w:pPr>
       <w:r>
         <w:rPr>
@@ -1360,6 +1392,7 @@
     <w:p>
       <w:pPr>
         <w:pStyle w:val="Heading2"/>
+        <w:keepNext/>
       </w:pPr>
       <w:r>
         <w:rPr>
@@ -1371,7 +1404,7 @@
     </w:p>
     <w:p>
       <w:r>
-        <w:t>Use a separate fictional demonstration copy TY-9001 and active members MBR-9001 and MBR-9002. Create fresh requests for this planned integration journey so earlier cancellation tests do not determine its queue order. Both members select Palmerston Hub for pickup. The journey remains planned until automatic allocation and handover are integrated.</w:t>
+        <w:t>The 14 October TY-9001 run used Asha MBR-9001 then Noah MBR-9002, both pickup Palmerston. Repair, protected transfer, receipt, staff collection and next-family readiness are reported. A later damaged return kept a new request waiting; repair increased pickup history to six, retained after restart. The fresh-copy demo guide uses TY-9101 to preserve this history.</w:t>
       </w:r>
     </w:p>
     <w:tbl>
@@ -1791,11 +1824,8 @@
             <w:shd w:fill="FFFFFF"/>
           </w:tcPr>
           <w:p>
-            <w:pPr>
-              <w:spacing w:before="0" w:after="40" w:line="240" w:lineRule="auto"/>
-            </w:pPr>
             <w:r>
-              <w:t>MBR-9001 checks out the toy through the Palmerston kiosk.</w:t>
+              <w:t>MBR-9001 checks out TY-9001 through Palmerston Reception. Separately test the linked demonstration patron at the configured kiosk.</w:t>
             </w:r>
           </w:p>
         </w:tc>
@@ -1897,6 +1927,7 @@
     <w:p>
       <w:pPr>
         <w:pStyle w:val="Heading2"/>
+        <w:keepNext/>
       </w:pPr>
       <w:r>
         <w:rPr>
@@ -1932,12 +1963,13 @@
     </w:p>
     <w:p>
       <w:r>
-        <w:t>Record requirement, date, branch, input, expected and actual result, tester, revision and evidence. Link failures to their fix and retest. These integration checks remain planned.</w:t>
+        <w:t>Record requirement, date, branch, fields, expected/actual result, tester, revision and evidence. The initial H01-H03 desk images are observed UI passes. The circulation record distinguishes supplied ready/rejection images from reported C01-C13 outcomes and pickup restart 6 to 6. Kiosk/API, concurrency, remaining notification cases and VM checks remain separate.</w:t>
       </w:r>
     </w:p>
     <w:p>
       <w:pPr>
         <w:pStyle w:val="Heading1"/>
+        <w:keepNext/>
       </w:pPr>
       <w:r>
         <w:rPr>
@@ -2033,6 +2065,7 @@
     <w:p>
       <w:pPr>
         <w:pStyle w:val="Heading2"/>
+        <w:keepNext/>
       </w:pPr>
       <w:r>
         <w:rPr>
@@ -2049,12 +2082,13 @@
     </w:p>
     <w:p>
       <w:r>
-        <w:t>The current review records the staff hold desk, branch schema integration and the capitalisation improvement. Remaining requirement answers, real person-hours and module acceptance outcomes are collected from the members rather than inferred from source presence or elapsed calendar time.</w:t>
+        <w:t>This review includes the compiled Windows circulation patch, seven applied migrations, inspected hold/rejection images and reported repair/branch/pickup results through 23:15 Darwin. Actual hours, accepted requirements decisions, team records and individual contributions must still be supplied by the members.</w:t>
       </w:r>
     </w:p>
     <w:p>
       <w:pPr>
         <w:pStyle w:val="Heading2"/>
+        <w:keepNext/>
       </w:pPr>
       <w:r>
         <w:rPr>
@@ -2070,6 +2104,9 @@
       </w:r>
     </w:p>
     <w:p>
+      <w:pPr>
+        <w:keepLines/>
+      </w:pPr>
       <w:r>
         <w:t>Include a technical clone, install and run manual tested on a virtual machine. All branches follow the same instructions and select their branch where appropriate. Include a patron search manual or video, integration diagrams and user journey maps. Submit the portfolio as PDF and the expanded repository link; update README module navigation, branch seeding and integration testing instructions.</w:t>
       </w:r>
@@ -2077,6 +2114,7 @@
     <w:p>
       <w:pPr>
         <w:pStyle w:val="Heading2"/>
+        <w:keepNext/>
       </w:pPr>
       <w:r>
         <w:rPr>
@@ -2094,6 +2132,7 @@
     <w:p>
       <w:pPr>
         <w:pStyle w:val="Heading1"/>
+        <w:keepNext/>
       </w:pPr>
       <w:r>
         <w:rPr>
@@ -2103,13 +2142,17 @@
       </w:r>
     </w:p>
     <w:p>
+      <w:pPr>
+        <w:spacing w:after="120"/>
+      </w:pPr>
       <w:r>
-        <w:t>The verified source merge is 74668e1. The subsequent staff hold desk and green interface are a local batch awaiting a verified pushed revision. Source observations and user-reported tests are distinguished below so the review remains traceable.</w:t>
+        <w:t>The integration baseline is dbbc540, with Mehakpreet's source from 3b925ee. Kamalpreet applied the circulation patch, built it on Windows and supplied the seven-migration Applied=True list. Inspected screenshots, reported outcomes and pending checks are kept distinct; the final combined submission revision is still to be identified.</w:t>
       </w:r>
     </w:p>
     <w:p>
       <w:pPr>
         <w:pStyle w:val="Heading2"/>
+        <w:keepNext/>
       </w:pPr>
       <w:r>
         <w:rPr>
@@ -2120,12 +2163,13 @@
     </w:p>
     <w:p>
       <w:r>
-        <w:t>Kamalpreet supplied LinkHoldsToPickupBranches. The reviewed migration creates an index on Holds.PickupBranchId and a restricted foreign key to Branches.Id, preserving the shared branch identifiers. The resulting relationship supports real pickup-branch selection. Transfer receipt and pickup notifications still require workflow integration.</w:t>
+        <w:t>Kamalpreet generated LinkHoldsToPickupBranches: the reviewed migration adds the pickup index and restricted FK to Branches.Id. All seven migrations are applied. The shared handover uses that branch relationship; first Palmerston receipt and pickup records are reported tested, with detailed captures still to be matched.</w:t>
       </w:r>
     </w:p>
     <w:p>
       <w:pPr>
         <w:pStyle w:val="Heading2"/>
+        <w:keepNext/>
       </w:pPr>
       <w:r>
         <w:rPr>
@@ -2135,13 +2179,17 @@
       </w:r>
     </w:p>
     <w:p>
+      <w:pPr>
+        <w:spacing w:after="120"/>
+      </w:pPr>
       <w:r>
-        <w:t>Kamalpreet reported completing duplicate-request rejection, two-member waiting order and waiting cancellation on 14 October. Three screenshots are saved on the laptop using the tester's own names or captions. Individual observed outcomes and image references have not yet been matched to the written test record. The expected outcomes remain in docs/HOLD_WORKFLOW_TEST_RECORD.md.</w:t>
+        <w:t>Five screenshot files in docs/screenshots were inspected after the dbbc540 push. Duplicate-request error.png verifies duplicate rejection for Asha / MBR-9001 / TY-0001. position 1 and 2.png and p1 and p2.png show Asha position 1 and Noah position 2. cancellation.png and cancellation1.png show Asha Cancelled with history retained and Noah position 1. Pickup is Darwin Hub. The saved second name is Noah, not the earlier suggested Noah Wilson. Cards show Awaiting return: this proves the borrowed-item UI case only.</w:t>
       </w:r>
     </w:p>
     <w:p>
       <w:pPr>
         <w:pStyle w:val="Heading2"/>
+        <w:keepNext/>
       </w:pPr>
       <w:r>
         <w:rPr>
@@ -2152,12 +2200,13 @@
     </w:p>
     <w:p>
       <w:r>
-        <w:t>The registration form visually displayed uppercase letters while its original model pattern accepted only uppercase input. The tester confirmed that lowercase typing caused a format error and uppercase re-entry succeeded. Kamalpreet then confirmed changing the pattern to ^[Mm][Bb][Rr]-[0-9]{4}$. This accepts natural letter case while preserving the membership format and existing uppercase storage. The particular lowercase registration retest is still to be confirmed.</w:t>
+        <w:t>The registration field visually displayed uppercase while its original pattern required uppercase underlying input. The tester confirmed lowercase typing caused an error and uppercase re-entry succeeded. The new ^[Mm][Bb][Rr]-[0-9]{4}$ pattern is verified in dbbc540; it accepts letter case while preserving format and uppercase storage. Specific lowercase registration, differently cased duplicate and malformed-input runtime retests remain pending.</w:t>
       </w:r>
     </w:p>
     <w:p>
       <w:pPr>
         <w:pStyle w:val="Heading2"/>
+        <w:keepNext/>
       </w:pPr>
       <w:r>
         <w:rPr>
@@ -2167,13 +2216,18 @@
       </w:r>
     </w:p>
     <w:p>
+      <w:pPr>
+        <w:spacing w:after="120"/>
+      </w:pPr>
       <w:r>
-        <w:t>Written requirements and test records are maintained from reported outcomes, source checks and available evidence. Current screenshots can be copied into docs/screenshots without renaming. The earlier notification observations remain documented even though their photo files are not retained locally. Final integration evidence will be captured when the corresponding checks are performed. The final portfolio also requires genuine member inputs for hours, contracts, meetings and individual reflections.</w:t>
+        <w:t>The records preserve five committed desk images and two later supplied images. Other circulation captures are held locally under the tester's filenames; the Waiting-only image is not captioned as proof of item condition. Reported pickup totals progressed four to six after repair and remained six after restart. Final portfolio inputs still include genuine hours, contracts, meetings, individual reflections and the VM run.</w:t>
       </w:r>
     </w:p>
     <w:sectPr>
       <w:headerReference w:type="default" r:id="rId9"/>
       <w:footerReference w:type="default" r:id="rId10"/>
+      <w:footerReference w:type="first" r:id="rId13"/>
+      <w:footerReference w:type="even" r:id="rId14"/>
       <w:pgSz w:w="12240" w:h="15840"/>
       <w:pgMar w:top="1008" w:right="1080" w:bottom="1008" w:left="1080" w:header="432" w:footer="432" w:gutter="0"/>
       <w:cols w:space="720"/>
@@ -2194,9 +2248,29 @@
       <w:rPr>
         <w:sz w:val="18"/>
       </w:rPr>
-      <w:t xml:space="preserve">Requirements version 0.2   |   Page </w:t>
+      <w:t xml:space="preserve">Requirements version 0.4   |   Page </w:t>
     </w:r>
     <w:fldSimple w:instr="PAGE"/>
+  </w:p>
+</w:ftr>
+</file>
+
+<file path=word/footer2.xml><?xml version="1.0" encoding="utf-8"?>
+<w:ftr xmlns:m="http://schemas.openxmlformats.org/officeDocument/2006/math" xmlns:mc="http://schemas.openxmlformats.org/markup-compatibility/2006" xmlns:mo="http://schemas.microsoft.com/office/mac/office/2008/main" xmlns:mv="urn:schemas-microsoft-com:mac:vml" xmlns:o="urn:schemas-microsoft-com:office:office" xmlns:r="http://schemas.openxmlformats.org/officeDocument/2006/relationships" xmlns:v="urn:schemas-microsoft-com:vml" xmlns:w10="urn:schemas-microsoft-com:office:word" xmlns:w14="http://schemas.microsoft.com/office/word/2010/wordml" xmlns:w="http://schemas.openxmlformats.org/wordprocessingml/2006/main" xmlns:wne="http://schemas.microsoft.com/office/word/2006/wordml" xmlns:wp14="http://schemas.microsoft.com/office/word/2010/wordprocessingDrawing" xmlns:wp="http://schemas.openxmlformats.org/drawingml/2006/wordprocessingDrawing" xmlns:wpc="http://schemas.microsoft.com/office/word/2010/wordprocessingCanvas" xmlns:wpg="http://schemas.microsoft.com/office/word/2010/wordprocessingGroup" xmlns:wpi="http://schemas.microsoft.com/office/word/2010/wordprocessingInk" xmlns:wps="http://schemas.microsoft.com/office/word/2010/wordprocessingShape" mc:Ignorable="w14 wp14">
+  <w:p>
+    <w:pPr>
+      <w:pStyle w:val="Footer"/>
+    </w:pPr>
+  </w:p>
+</w:ftr>
+</file>
+
+<file path=word/footer3.xml><?xml version="1.0" encoding="utf-8"?>
+<w:ftr xmlns:m="http://schemas.openxmlformats.org/officeDocument/2006/math" xmlns:mc="http://schemas.openxmlformats.org/markup-compatibility/2006" xmlns:mo="http://schemas.microsoft.com/office/mac/office/2008/main" xmlns:mv="urn:schemas-microsoft-com:mac:vml" xmlns:o="urn:schemas-microsoft-com:office:office" xmlns:r="http://schemas.openxmlformats.org/officeDocument/2006/relationships" xmlns:v="urn:schemas-microsoft-com:vml" xmlns:w10="urn:schemas-microsoft-com:office:word" xmlns:w14="http://schemas.microsoft.com/office/word/2010/wordml" xmlns:w="http://schemas.openxmlformats.org/wordprocessingml/2006/main" xmlns:wne="http://schemas.microsoft.com/office/word/2006/wordml" xmlns:wp14="http://schemas.microsoft.com/office/word/2010/wordprocessingDrawing" xmlns:wp="http://schemas.openxmlformats.org/drawingml/2006/wordprocessingDrawing" xmlns:wpc="http://schemas.microsoft.com/office/word/2010/wordprocessingCanvas" xmlns:wpg="http://schemas.microsoft.com/office/word/2010/wordprocessingGroup" xmlns:wpi="http://schemas.microsoft.com/office/word/2010/wordprocessingInk" xmlns:wps="http://schemas.microsoft.com/office/word/2010/wordprocessingShape" mc:Ignorable="w14 wp14">
+  <w:p>
+    <w:pPr>
+      <w:pStyle w:val="Footer"/>
+    </w:pPr>
   </w:p>
 </w:ftr>
 </file>

</xml_diff>

<commit_message>
organise screenshots and update rubric progress review
</commit_message>
<xml_diff>
--- a/docs/HIT339_Group8_Requirements_Draft.docx
+++ b/docs/HIT339_Group8_Requirements_Draft.docx
@@ -21,7 +21,7 @@
     </w:p>
     <w:p>
       <w:r>
-        <w:t>Version 0.4   Status Windows circulation results and remaining acceptance work</w:t>
+        <w:t>Version 0.5   Status Pushed circulation checkpoint and indexed image evidence</w:t>
       </w:r>
     </w:p>
     <w:p>
@@ -1963,7 +1963,7 @@
     </w:p>
     <w:p>
       <w:r>
-        <w:t>Record requirement, date, branch, fields, expected/actual result, tester, revision and evidence. The initial H01-H03 desk images are observed UI passes. The circulation record distinguishes supplied ready/rejection images from reported C01-C13 outcomes and pickup restart 6 to 6. Kiosk/API, concurrency, remaining notification cases and VM checks remain separate.</w:t>
+        <w:t>Record requirement, date, branch, fields, expected/actual result, tester, revision and evidence. The screenshot index now maps all 21 pushed images and three restored historical photos. Captions distinguish visible results from reported repair/restart counts. Kiosk/API, concurrency, remaining notification cases and VM checks remain separate.</w:t>
       </w:r>
     </w:p>
     <w:p>
@@ -2082,7 +2082,7 @@
     </w:p>
     <w:p>
       <w:r>
-        <w:t>This review includes the compiled Windows circulation patch, seven applied migrations, inspected hold/rejection images and reported repair/branch/pickup results through 23:15 Darwin. Actual hours, accepted requirements decisions, team records and individual contributions must still be supplied by the members.</w:t>
+        <w:t>This review includes the built Windows circulation patch, seven applied migrations and the pushed a1e8190 checkpoint. The 21 images are indexed and three historical notification photos are restored. Actual hours, accepted requirement decisions, team records and individual contributions remain member inputs.</w:t>
       </w:r>
     </w:p>
     <w:p>
@@ -2146,7 +2146,7 @@
         <w:spacing w:after="120"/>
       </w:pPr>
       <w:r>
-        <w:t>The integration baseline is dbbc540, with Mehakpreet's source from 3b925ee. Kamalpreet applied the circulation patch, built it on Windows and supplied the seven-migration Applied=True list. Inspected screenshots, reported outcomes and pending checks are kept distinct; the final combined submission revision is still to be identified.</w:t>
+        <w:t>The pushed checkpoint a1e8190 combines baseline dbbc540 and Mehakpreet's source from 3b925ee. It matches the prepared circulation release that Kamalpreet built and tested on Windows. All seven migrations are applied. Image observations, tester reports and pending checks are distinguished; the final seven-module submission revision remains outstanding.</w:t>
       </w:r>
     </w:p>
     <w:p>
@@ -2163,7 +2163,7 @@
     </w:p>
     <w:p>
       <w:r>
-        <w:t>Kamalpreet generated LinkHoldsToPickupBranches: the reviewed migration adds the pickup index and restricted FK to Branches.Id. All seven migrations are applied. The shared handover uses that branch relationship; first Palmerston receipt and pickup records are reported tested, with detailed captures still to be matched.</w:t>
+        <w:t>Kamalpreet generated LinkHoldsToPickupBranches: the reviewed migration adds the pickup index and restricted FK to Branches.Id. All seven migrations are applied. The shared handover uses that branch relationship; Palmerston receipt and pickup records are now matched to the inspected screenshots.</w:t>
       </w:r>
     </w:p>
     <w:p>
@@ -2183,7 +2183,7 @@
         <w:spacing w:after="120"/>
       </w:pPr>
       <w:r>
-        <w:t>Five screenshot files in docs/screenshots were inspected after the dbbc540 push. Duplicate-request error.png verifies duplicate rejection for Asha / MBR-9001 / TY-0001. position 1 and 2.png and p1 and p2.png show Asha position 1 and Noah position 2. cancellation.png and cancellation1.png show Asha Cancelled with history retained and Noah position 1. Pickup is Darwin Hub. The saved second name is Noah, not the earlier suggested Noah Wilson. Cards show Awaiting return: this proves the borrowed-item UI case only.</w:t>
+        <w:t>The initial five images verify duplicate rejection, Asha position 1 / Noah position 2 and cancellation promoting Noah while retaining Asha history. Later images show the damaged queue, allocation/no early notice, protected transfer errors, receipt, pickup Email/SMS and collection/next-family cards. All images have descriptive names and original-name mappings in docs/screenshots/README.md.</w:t>
       </w:r>
     </w:p>
     <w:p>
@@ -2220,7 +2220,7 @@
         <w:spacing w:after="120"/>
       </w:pPr>
       <w:r>
-        <w:t>The records preserve five committed desk images and two later supplied images. Other circulation captures are held locally under the tester's filenames; the Waiting-only image is not captioned as proof of item condition. Reported pickup totals progressed four to six after repair and remained six after restart. Final portfolio inputs still include genuine hours, contracts, meetings, individual reflections and the VM run.</w:t>
+        <w:t>The audit retains all 21 pushed images unchanged and restores three earlier notification photos. A checkout-form image has no rejection message; the new Asha Waiting image says Awaiting return. Those captions describe only visible facts. Damaged-return and later repair/restart totals remain tester reports. Final portfolio inputs still include genuine hours, contracts, meetings, individual reflections and the VM run.</w:t>
       </w:r>
     </w:p>
     <w:sectPr>
@@ -2248,7 +2248,7 @@
       <w:rPr>
         <w:sz w:val="18"/>
       </w:rPr>
-      <w:t xml:space="preserve">Requirements version 0.4   |   Page </w:t>
+      <w:t xml:space="preserve">Requirements version 0.5   |   Page </w:t>
     </w:r>
     <w:fldSimple w:instr="PAGE"/>
   </w:p>

</xml_diff>

<commit_message>
Update project records, member evidence and remaining work
</commit_message>
<xml_diff>
--- a/docs/HIT339_Group8_Requirements_Draft.docx
+++ b/docs/HIT339_Group8_Requirements_Draft.docx
@@ -16,12 +16,12 @@
     </w:p>
     <w:p>
       <w:r>
-        <w:t>Group 8   |   HIT339 Distributed Development   |   Updated 14 October 2026</w:t>
+        <w:t>Group 8   |   HIT339 Distributed Development   |   Updated 15 October 2026</w:t>
       </w:r>
     </w:p>
     <w:p>
       <w:r>
-        <w:t>Version 0.5   Status Pushed circulation checkpoint and indexed image evidence</w:t>
+        <w:t>Version 0.7   Status Patron placement and project evidence update</w:t>
       </w:r>
     </w:p>
     <w:p>
@@ -837,7 +837,7 @@
     </w:p>
     <w:p>
       <w:r>
-        <w:t>Patrons sign in through ASP.NET Core Identity. A unique optional Identity link identifies the Borrower, and private account data is resolved from the authenticated user ID. Scanner or keyboard input uses LibraryCode. The applied source includes private account, hold progress and shared checkout; two-minute privacy and runtime ownership/checkout checks remain pending.</w:t>
+        <w:t>Patron accounts use ASP.NET Core Identity and a unique optional Borrower link. The authenticated user ID determines private data and hold ownership; LibraryCode supports scan or keyboard input. Account, patron-hold and shared-checkout source is implemented. PH01–PH03 show placement, FIFO and membership-access results; final checkout/security checks remain pending.</w:t>
       </w:r>
     </w:p>
     <w:p>
@@ -1091,7 +1091,7 @@
         <w:keepLines/>
       </w:pPr>
       <w:r>
-        <w:t>Required outcome: Holds on borrowed or damaged copies notify the next eligible person when a usable copy is ready. Staff placement/cancellation and shared return, repair, transfer and checkout hooks are implemented. The kiosk displays only the linked patron's hold progress; private runtime checks remain pending. Patron self-service placement and pickup expiry remain later targets.</w:t>
+        <w:t>Required outcome: Patrons request borrowed or damaged copies and the next eligible member is notified when the copy is ready. Staff and patron placement share validation; return, repair, transfer and checkout preserve the allocation. PH01–PH03 show placement, FIFO and membership-access results. POST/privacy and concurrency checks remain pending; pickup expiry is optional.</w:t>
       </w:r>
     </w:p>
     <w:p>
@@ -1240,7 +1240,7 @@
     </w:p>
     <w:p>
       <w:r>
-        <w:t>The brief permits CSV upload or a mock metadata provider. We propose CSV upload, with a validation preview before staff confirm import. Common fields are ItemType, LibraryCode, Name, Description and BranchCode. The uploader supplies the existing required fields for the selected item type.</w:t>
+        <w:t>The brief permits CSV upload or a mock provider. Sandesh's current utility imports books at a selected active branch, using Title, Author, ISBN, Category and Quantity. Quantity handling, publication-year validation and row-specific errors remain corrective work. Other item types and changes to the CSV schema remain scope proposals for review.</w:t>
       </w:r>
     </w:p>
     <w:p>
@@ -1251,10 +1251,14 @@
         <w:rPr>
           <w:b/>
         </w:rPr>
-        <w:t>I01</w:t>
+        <w:t xml:space="preserve">I01  </w:t>
       </w:r>
+      <w:r/>
       <w:r>
-        <w:t xml:space="preserve">  A valid file creates books, music and toys at the specified existing branches. Book fields include Author, BookGenre and PublicationYear; music fields include Artist, MusicGenre, ReleaseYear and Format; toy fields include ToyType and RecommendedAge.</w:t>
+        <w:rPr>
+          <w:b w:val="0"/>
+        </w:rPr>
+        <w:t>A valid file creates the supported item type at the selected active branch, with unique physical library codes and valid model values. For the current book importer, validate Author, BookGenre, PublicationYear and the CSV-to-model mapping. Music/toy import remains a scope proposal.</w:t>
       </w:r>
     </w:p>
     <w:p>
@@ -1328,10 +1332,14 @@
         <w:rPr>
           <w:b/>
         </w:rPr>
-        <w:t>M02</w:t>
+        <w:t xml:space="preserve">M02  </w:t>
       </w:r>
+      <w:r/>
       <w:r>
-        <w:t xml:space="preserve">  Revenue totals come from recorded payments. Accruing and unpaid fines are shown separately. Each payment record identifies its loan, amount, time, staff member and receiving branch; repeating a paid action creates no second payment.</w:t>
+        <w:rPr>
+          <w:b w:val="0"/>
+        </w:rPr>
+        <w:t>Collected fine revenue uses the stored fine amount and paid status/date, with loan references so a manager can trace the total. Unpaid amounts and any accruing estimates are labelled separately; repeating a paid action does not increase revenue twice. A separate transaction ledger is a future enhancement.</w:t>
       </w:r>
     </w:p>
     <w:p>
@@ -1386,7 +1394,7 @@
     </w:p>
     <w:p>
       <w:r>
-        <w:t>A paid fine creates a durable payment record. Reports distinguish estimated accruing fines, final unpaid fines and money collected. A zero fine creates no payment receipt. Historical demonstration records with no payment evidence must be labelled or reseeded consistently.</w:t>
+        <w:t>The current loan record stores the final fine, paid flag and payment date. Reports distinguish unpaid fines, amounts marked paid and any estimated accruing charges. Trace totals back to the relevant loan records. A separate payment-transaction ledger and partial payments remain optional future work.</w:t>
       </w:r>
     </w:p>
     <w:p>
@@ -1963,7 +1971,7 @@
     </w:p>
     <w:p>
       <w:r>
-        <w:t>Record requirement, date, branch, fields, expected/actual result, tester, revision and evidence. The screenshot index now maps all 21 pushed images and three restored historical photos. Captions distinguish visible results from reported repair/restart counts. Kiosk/API, concurrency, remaining notification cases and VM checks remain separate.</w:t>
+        <w:t>Record requirement, date, branch, inputs, expected/actual result, tester, revision and evidence. The index maps 36 captures: 28 lead images and eight Sandesh component images. Captions distinguish visible facts from reported inputs/results. Final kiosk/API, concurrency, notification and VM checks remain separate.</w:t>
       </w:r>
     </w:p>
     <w:p>
@@ -2077,12 +2085,12 @@
     </w:p>
     <w:p>
       <w:r>
-        <w:t>Kamalpreet coordinates requirement decisions and reports observed behaviour. Written updates are compiled from those reports and inspected source with AI assistance. Each module lead reviews the checks and dependencies for their own contribution. Group acceptance still requires the actual date and members who agreed; each material change identifies its reason, affected requirements and tests.</w:t>
+        <w:t>Kamalpreet coordinates requirements and test records. Each module lead reviews their interfaces and checks. All four members accepted the original agreement on the day it was created and shared; the calendar date is unrecorded. Changes record the reason, affected requirements and tests. AI assistance is acknowledged separately.</w:t>
       </w:r>
     </w:p>
     <w:p>
       <w:r>
-        <w:t>This review includes the built Windows circulation patch, seven applied migrations and the pushed a1e8190 checkpoint. The 21 images are indexed and three historical notification photos are restored. Actual hours, accepted requirement decisions, team records and individual contributions remain member inputs.</w:t>
+        <w:t>Source checkpoint 6a69ade has the recorded Windows build and seven applied migrations. The 28 lead captures and eight Sandesh test images are indexed separately. Sandesh's 2ab17fa source and report are received. Harsimran's guide records an unpassed VM setup; Mehakpreet's newer source is merged in master deeeaac. The complete integrated release and remaining member records are still outstanding.</w:t>
       </w:r>
     </w:p>
     <w:p>
@@ -2220,7 +2228,7 @@
         <w:spacing w:after="120"/>
       </w:pPr>
       <w:r>
-        <w:t>The audit retains all 21 pushed images unchanged and restores three earlier notification photos. A checkout-form image has no rejection message; the new Asha Waiting image says Awaiting return. Those captions describe only visible facts. Damaged-return and later repair/restart totals remain tester reports. Final portfolio inputs still include genuine hours, contracts, meetings, individual reflections and the VM run.</w:t>
+        <w:t>The evidence set retains the earlier 28 captures and adds Sandesh's eight test images. Captions distinguish visible results from supplied inputs and reports. All four accepted the original agreement on creation/sharing day; the calendar date is unrecorded. Remaining portfolio work includes member records, minutes, technical corrections and the VM run.</w:t>
       </w:r>
     </w:p>
     <w:sectPr>
@@ -2248,7 +2256,7 @@
       <w:rPr>
         <w:sz w:val="18"/>
       </w:rPr>
-      <w:t xml:space="preserve">Requirements version 0.5   |   Page </w:t>
+      <w:t xml:space="preserve">Requirements version 0.7   |   Page </w:t>
     </w:r>
     <w:fldSimple w:instr="PAGE"/>
   </w:p>

</xml_diff>

<commit_message>
Integrate stock reporting, imports and release verification
Build on the lead seven-migration circulation source and incorporate Sandesh's importer/report work through da0f483. Share availability across reports/API, add physical-copy and year validation, fine/inventory audits, production-code tests and current member records. Linux automated run: 30 passed, 3 SQL Server checks skipped. Windows/VM acceptance remains explicit. Prepared with Codex assistance; original member contributions remain attributed.
</commit_message>
<xml_diff>
--- a/docs/HIT339_Group8_Requirements_Draft.docx
+++ b/docs/HIT339_Group8_Requirements_Draft.docx
@@ -15,13 +15,14 @@
       </w:r>
     </w:p>
     <w:p>
+      <w:r/>
       <w:r>
-        <w:t>Group 8   |   HIT339 Distributed Development   |   Updated 15 October 2026</w:t>
+        <w:t>Group 8   |   HIT339 Distributed Development   |   Updated 16 October 2026</w:t>
       </w:r>
     </w:p>
     <w:p>
       <w:r>
-        <w:t>Version 0.7   Status Patron placement and project evidence update</w:t>
+        <w:t>Version 0.8   Status Combined release and verification update</w:t>
       </w:r>
     </w:p>
     <w:p>
@@ -770,7 +771,7 @@
         <w:spacing w:after="120"/>
       </w:pPr>
       <w:r>
-        <w:t>The circulation integration combines baseline dbbc540 and Mehakpreet's 3b925ee source. Windows build succeeded and all seven migrations show Applied=True. Initial hold screenshots and later reported return, repair, protected transfer and next-family collection outcomes are recorded. Pickup history stayed six after restart. Kiosk/API, simultaneous checkout, import/reports, final member records and VM verification remain outstanding.</w:t>
+        <w:t>The 16 October release combines the tested lead source 9b28459 with Sandesh's da0f483 corrections and the kiosk/API/branch work in those histories. The application compiles on .NET 10; automated production-code and model/export checks are recorded separately from Windows SQL Server and VM checks. Earlier seven-migration Windows history and hold/transfer evidence are retained. Final Windows verification, successful VM installation and the one-PDF portfolio remain outstanding.</w:t>
       </w:r>
     </w:p>
     <w:p>
@@ -914,12 +915,12 @@
         <w:keepLines/>
       </w:pPr>
       <w:r>
-        <w:t>Required outcome: External applications query available items, categories and operating status through authenticated read-only REST endpoints. Mehakpreet's current routes are GET /api/catalogue/available, /api/catalogue/categories and /api/catalogue/status, with search and item lookup under /api/catalogue. API-key configuration and authentication results remain to be verified after integration.</w:t>
+        <w:t>Required outcome: External applications query available copies, categories and operating status through API-key-protected read-only REST endpoints. Current routes are GET /api/catalogue, /available, /categories, /status and /{code}. Item queries support category, active branchId and limit; search is available on the catalogue route. Middleware and query rules have automated tests; final HTTPS requests remain to be run on Windows.</w:t>
       </w:r>
     </w:p>
     <w:p>
       <w:r>
-        <w:t>The current API reports system and database health. Whether branch opening status is also expected remains Q3. Shared availability excludes active loans, transit and reservations in source; final API authentication and availability responses remain to be demonstrated.</w:t>
+        <w:t>The API reports system/database health and configured active branch flags. Live opening hours are not configured; clarification of that interpretation remains Q3. Shared availability excludes active loans, transit and reservations. It is also used by manager reports, so these channels follow the same eligibility rules.</w:t>
       </w:r>
     </w:p>
     <w:p>
@@ -1240,7 +1241,7 @@
     </w:p>
     <w:p>
       <w:r>
-        <w:t>The brief permits CSV upload or a mock provider. Sandesh's current utility imports books at a selected active branch, using Title, Author, ISBN, Category and Quantity. Quantity handling, publication-year validation and row-specific errors remain corrective work. Other item types and changes to the CSV schema remain scope proposals for review.</w:t>
+        <w:t>The brief permits CSV upload or a mock provider. The current importer requires Title, Author, ISBN, Category, Quantity and PublicationYear; Publisher is optional. Quantity creates separately coded physical copies at a selected active branch. Invalid years, non-positive quantities, missing/duplicate headers and existing ISBNs produce validation outcomes. Accepted/skipped rows and copy counts are explained. Automated fixtures pass; the final Windows upload remains a separate check.</w:t>
       </w:r>
     </w:p>
     <w:p>
@@ -1269,10 +1270,10 @@
         <w:rPr>
           <w:b/>
         </w:rPr>
-        <w:t>I02</w:t>
       </w:r>
+      <w:r/>
       <w:r>
-        <w:t xml:space="preserve">  Invalid headers, unknown types or branches, missing required values, invalid codes and duplicate codes produce row specific errors. Proposed behaviour is all or nothing: no rows are saved while validation errors remain.</w:t>
+        <w:t>I02  Missing or duplicate required headers reject the upload. Invalid rows are skipped with reasons while valid rows are accepted. The accepted rows are saved in one transaction; a database failure rolls that transaction back.</w:t>
       </w:r>
     </w:p>
     <w:p>
@@ -1283,10 +1284,10 @@
         <w:rPr>
           <w:b/>
         </w:rPr>
-        <w:t>I03</w:t>
       </w:r>
+      <w:r/>
       <w:r>
-        <w:t xml:space="preserve">  New imported stock starts Available. Importing the same file again reports duplicates without overwriting items. The confirmed import records the staff member, time and number of records created.</w:t>
+        <w:t>I03  Imported copies start Available at the selected active branch. Re-importing an existing ISBN skips it without overwriting records. The response reports accepted/skipped rows and copies created. A persistent staff-by-staff import audit is a future enhancement.</w:t>
       </w:r>
     </w:p>
     <w:p>
@@ -1306,8 +1307,9 @@
       <w:pPr>
         <w:keepLines/>
       </w:pPr>
+      <w:r/>
       <w:r>
-        <w:t>Required outcome: Managers report borrowing statistics, fine revenue audits and inventory health, with export capability. We propose both CSV and PDF exports, filtered by branch and reporting dates. The dashboard will show each filter and the report generation time.</w:t>
+        <w:t>Required outcome: Managers report borrowing statistics, fine revenue audits and inventory health, with CSV and PDF exports. The current report covers the whole collection and displays generation time. Branch/date reporting filters remain an optional enhancement.</w:t>
       </w:r>
     </w:p>
     <w:p>
@@ -1350,10 +1352,10 @@
         <w:rPr>
           <w:b/>
         </w:rPr>
-        <w:t>M03</w:t>
       </w:r>
+      <w:r/>
       <w:r>
-        <w:t xml:space="preserve">  CSV and PDF outputs reflect the displayed filters and reconcile with the underlying records. Staff without manager reporting permission cannot open or export these reports.</w:t>
+        <w:t>M03  Dashboard, CSV and PDF reconcile for the same stable dataset. Fine and inventory audit rows explain totals; PDF explicitly limits detailed rows and refers to the full CSV. Staff without manager reporting permission cannot open or export reports.</w:t>
       </w:r>
     </w:p>
     <w:p>
@@ -1971,7 +1973,7 @@
     </w:p>
     <w:p>
       <w:r>
-        <w:t>Record requirement, date, branch, inputs, expected/actual result, tester, revision and evidence. The index maps 36 captures: 28 lead images and eight Sandesh component images. Captions distinguish visible facts from reported inputs/results. Final kiosk/API, concurrency, notification and VM checks remain separate.</w:t>
+        <w:t>Record requirement, date, branch, inputs, expected/actual result, tester, revision and evidence. Existing lead and member captures remain historical evidence. The 16 October automated tests and synthetic CSV/PDF exports are labelled separately in docs/RELEASE_CHECKS_16OCT.md. InMemory query tests are not SQL Server transaction or VM passes. Final browser, real SQL and VM checks remain visible.</w:t>
       </w:r>
     </w:p>
     <w:p>
@@ -2020,12 +2022,14 @@
       </w:pPr>
       <w:r>
         <w:rPr>
-          <w:b/>
+          <w:b w:val="0"/>
         </w:rPr>
-        <w:t>Q3</w:t>
+        <w:t>Q3  The API uses an external client key kept outside committed source. Operating status currently means service/database health plus configured active branch flags. Confirm with the lecturer/client whether live branch opening hours are required; no approval of this interpretation is inferred.</w:t>
       </w:r>
       <w:r>
-        <w:t xml:space="preserve">  Who consumes the API, and how should they authenticate? Proposed default is an external client credential stored outside committed source. Confirm whether operating status means branch open or closed status, system health, or both.</w:t>
+        <w:rPr>
+          <w:b w:val="0"/>
+        </w:rPr>
       </w:r>
     </w:p>
     <w:p>
@@ -2064,10 +2068,10 @@
         <w:rPr>
           <w:b/>
         </w:rPr>
-        <w:t>Q6</w:t>
       </w:r>
+      <w:r/>
       <w:r>
-        <w:t xml:space="preserve">  Does the group accept all or nothing CSV validation? The brief permits CSV upload. Confirm whether the CSV/PDF wording expects one export format or both; the proposed implementation provides both.</w:t>
+        <w:t>Q6  The current CSV utility accepts valid rows and explains skipped invalid rows; accepted rows save together. This replaces the earlier all-or-nothing proposal. Both CSV and PDF manager exports are implemented; final Windows outcomes remain to be recorded.</w:t>
       </w:r>
     </w:p>
     <w:p>
@@ -2090,7 +2094,7 @@
     </w:p>
     <w:p>
       <w:r>
-        <w:t>Source checkpoint 6a69ade has the recorded Windows build and seven applied migrations. The 28 lead captures and eight Sandesh test images are indexed separately. Sandesh's 2ab17fa source and report are received. Harsimran's guide records an unpassed VM setup; Mehakpreet's newer source is merged in master deeeaac. The complete integrated release and remaining member records are still outstanding.</w:t>
+        <w:t>The combined release preserves the lead seven-migration database chain and integrates the member contributions. Harsimran's report, Mehakpreet's reflection, Sandesh's report and team minutes are received. Harsimran's 31 hours are confirmed; Mehak's proposed 48-hour correction needs confirmation; Kamalpreet and Sandesh have partial time records. The VM attempt remains unsuccessful and no alternative approval is recorded.</w:t>
       </w:r>
     </w:p>
     <w:p>
@@ -2154,7 +2158,7 @@
         <w:spacing w:after="120"/>
       </w:pPr>
       <w:r>
-        <w:t>The pushed checkpoint a1e8190 combines baseline dbbc540 and Mehakpreet's source from 3b925ee. It matches the prepared circulation release that Kamalpreet built and tested on Windows. All seven migrations are applied. Image observations, tester reports and pending checks are distinguished; the final seven-module submission revision remains outstanding.</w:t>
+        <w:t>The earlier a1e8190/dbbc540/3b925ee checkpoint records a successful Windows build and seven applied migrations. The 16 October combined release adds corrected importer/report logic and production-code regression tests. Its actual final revision and Windows outcomes must be recorded after import; earlier screenshots do not establish that the new release was run.</w:t>
       </w:r>
     </w:p>
     <w:p>
@@ -2228,7 +2232,7 @@
         <w:spacing w:after="120"/>
       </w:pPr>
       <w:r>
-        <w:t>The evidence set retains the earlier 28 captures and adds Sandesh's eight test images. Captions distinguish visible results from supplied inputs and reports. All four accepted the original agreement on creation/sharing day; the calendar date is unrecorded. Remaining portfolio work includes member records, minutes, technical corrections and the VM run.</w:t>
+        <w:t>All four members accepted the original agreement on creation/sharing day; the calendar date was not recorded. Team minutes and all four individual accounts are available. Final portfolio work is to confirm outstanding time entries, run the Windows/VM checks or obtain an approved alternative, record the final source revision and assemble the required single PDF.</w:t>
       </w:r>
     </w:p>
     <w:sectPr>
@@ -2256,9 +2260,13 @@
       <w:rPr>
         <w:sz w:val="18"/>
       </w:rPr>
-      <w:t xml:space="preserve">Requirements version 0.7   |   Page </w:t>
+      <w:t xml:space="preserve">Requirements version 0.8   |   Page </w:t>
     </w:r>
-    <w:fldSimple w:instr="PAGE"/>
+    <w:fldSimple w:instr="PAGE">
+      <w:r>
+        <w:t>1</w:t>
+      </w:r>
+    </w:fldSimple>
   </w:p>
 </w:ftr>
 </file>

</xml_diff>